<commit_message>
build(docx): update reference.docx footer date to August 2026
DOC_DATE in scripts/build-reference-docx.py was still "July 2026",
so every page's footer in the generated Word/PDF showed a stale
month. Updated the constant and regenerated publication/reference.docx
to match.

Co-Authored-By: Claude Sonnet 5 <noreply@anthropic.com>
</commit_message>
<xml_diff>
--- a/publication/reference.docx
+++ b/publication/reference.docx
@@ -419,7 +419,7 @@
     </w:fldSimple>
     <w:r>
       <w:tab/>
-      <w:t>July 2026</w:t>
+      <w:t>August 2026</w:t>
     </w:r>
   </w:p>
 </w:ftr>
@@ -445,7 +445,7 @@
     </w:fldSimple>
     <w:r>
       <w:tab/>
-      <w:t>July 2026</w:t>
+      <w:t>August 2026</w:t>
     </w:r>
   </w:p>
 </w:ftr>

</xml_diff>